<commit_message>
Update: Update file docs and project pplanning
</commit_message>
<xml_diff>
--- a/docs/HMDA_New_York_Project_Planning.docx
+++ b/docs/HMDA_New_York_Project_Planning.docx
@@ -31,9 +31,9 @@
         <w:rPr>
           <w:b w:val="0"/>
         </w:rPr>
-        <w:t>Phạm vi và thiết kế thực nghiệm phiên bản 1.1</w:t>
+        <w:t>Phạm vi và thiết kế thực nghiệm phiên bản 1.2</w:t>
         <w:br/>
-        <w:t>Đồng bộ ba RQ và protocol ngày 08 tháng 09 năm 2026</w:t>
+        <w:t>Đồng bộ ba RQ và protocol ngày 11 tháng 09 năm 2026</w:t>
       </w:r>
     </w:p>
     <w:p>
@@ -42,6 +42,38 @@
       </w:pPr>
       <w:r>
         <w:t>1 Mục tiêu và phạm vi</w:t>
+      </w:r>
+    </w:p>
+    <w:p>
+      <w:pPr>
+        <w:pStyle w:val="Heading2"/>
+      </w:pPr>
+      <w:r>
+        <w:t>Bối cảnh kinh doanh</w:t>
+      </w:r>
+    </w:p>
+    <w:p>
+      <w:pPr/>
+      <w:r>
+        <w:t>Trong mortgage lending, quyết định phê duyệt chỉ giải quyết khả năng cấp tín dụng; ngân hàng chỉ ghi nhận một khoản vay phát sinh khi hồ sơ đi đến closing hoặc account opening. Vì vậy, hồ sơ bị từ chối và hồ sơ đã được phê duyệt nhưng không trở thành khoản vay là hai kết quả khác nhau. Kết quả thứ nhất liên quan đến credit decision, còn kết quả thứ hai phản ánh post-approval conversion của mortgage application funnel.</w:t>
+      </w:r>
+    </w:p>
+    <w:p>
+      <w:pPr/>
+      <w:r>
+        <w:t>Regulation C quy định Application approved but not accepted khi tổ chức tài chính đã phê duyệt hồ sơ trước closing hoặc account opening, chỉ còn các điều kiện cam kết hoặc closing thông thường, nhưng người nộp đơn hoặc bên nhận hồ sơ không phản hồi, hoặc giao dịch không được hoàn tất. Người vay cũng có thể xem xét nhiều đề nghị và không tiếp tục với một lender. HMDA không ghi nguyên nhân cụ thể của từng hồ sơ lớp 2, nên các lý do về pricing, cạnh tranh, trải nghiệm hay sự cố closing chỉ được xem là giả thuyết cần dữ liệu bổ sung, không phải kết luận của nghiên cứu. [15, 17]</w:t>
+      </w:r>
+    </w:p>
+    <w:p>
+      <w:pPr/>
+      <w:r>
+        <w:t>Đối với ngân hàng, các khoản vay trong pipeline không đi đến closing được quản trị như fallout. Fallout làm giảm độ chính xác của dự báo số khoản vay sẽ phát sinh và có thể ảnh hưởng đến quản trị pipeline hoặc hedging đối với các khoản vay đã khóa lãi suất. OCC khuyến nghị phân tích lịch sử fallout trong những điều kiện thị trường khác nhau; tài liệu này chỉ dùng căn cứ đó để xác lập nhu cầu kinh doanh, không khẳng định toàn bộ action_taken = 2 thuộc rate-locked pipeline hoặc đã gây ra một mức tổn thất cụ thể. [16]</w:t>
+      </w:r>
+    </w:p>
+    <w:p>
+      <w:pPr/>
+      <w:r>
+        <w:t>Bài toán nghiên cứu vì vậy là đánh giá trạng thái cuối của hồ sơ theo hai góc nhìn liên kết: approval so với denial, và origination so với approved but not accepted trong nhóm đã được phê duyệt. Mô hình ba lớp giữ nguyên ba nhãn danh nghĩa để tránh mất thông tin, còn kết quả được dùng cho phân tích hiệu năng, giải thích toàn cục và audit fairness. Nghiên cứu không thay thế underwriting, không tối ưu profit và không xác định nguyên nhân cá nhân khiến một hồ sơ không đi đến origination.</w:t>
       </w:r>
     </w:p>
     <w:p>
@@ -824,15 +856,8 @@
             </w:tcMar>
           </w:tcPr>
           <w:p>
-            <w:pPr>
-              <w:spacing w:after="20" w:line="247" w:lineRule="auto"/>
-            </w:pPr>
             <w:r>
-              <w:rPr>
-                <w:b w:val="0"/>
-                <w:sz w:val="18"/>
-              </w:rPr>
-              <w:t>Hồ sơ được chấp thuận nhưng người nộp đơn không chấp nhận.</w:t>
+              <w:t>Hồ sơ đã được phê duyệt trước closing hoặc account opening nhưng người nộp đơn/bên nhận hồ sơ không phản hồi, hoặc khoản vay không được hoàn tất. HMDA không cho biết nguyên nhân cụ thể của từng hồ sơ.</w:t>
             </w:r>
           </w:p>
         </w:tc>
@@ -6619,6 +6644,28 @@
           </w:p>
         </w:tc>
       </w:tr>
+      <w:tr>
+        <w:tc>
+          <w:tcPr>
+            <w:tcW w:type="dxa" w:w="3798"/>
+          </w:tcPr>
+          <w:p>
+            <w:r>
+              <w:t>Business context trước đây chỉ mô tả mục tiêu kỹ thuật</w:t>
+            </w:r>
+          </w:p>
+        </w:tc>
+        <w:tc>
+          <w:tcPr>
+            <w:tcW w:type="dxa" w:w="5953"/>
+          </w:tcPr>
+          <w:p>
+            <w:r>
+              <w:t>Bổ sung mortgage application funnel, phân biệt credit decision với post-approval fallout và giới hạn nguyên nhân không quan sát được trong HMDA.</w:t>
+            </w:r>
+          </w:p>
+        </w:tc>
+      </w:tr>
     </w:tbl>
     <w:p>
       <w:pPr>
@@ -7104,7 +7151,7 @@
         <w:rPr>
           <w:b w:val="0"/>
         </w:rPr>
-        <w:t>Nguồn phương pháp và định nghĩa được đối chiếu ngày 08 tháng 09 năm 2026. Các lựa chọn như 12 feature, tỷ lệ chia tập, năm model và phạm vi mở rộng là thiết kế của dự án; không phải yêu cầu từ CFPB hoặc kết quả đã được kiểm nghiệm.</w:t>
+        <w:t>Nguồn phương pháp và định nghĩa được đối chiếu ngày 11 tháng 09 năm 2026. Các lựa chọn như 12 feature, tỷ lệ chia tập, năm model và phạm vi mở rộng là thiết kế của dự án; không phải yêu cầu từ CFPB hoặc kết quả đã được kiểm nghiệm.</w:t>
       </w:r>
     </w:p>
     <w:p>
@@ -7386,6 +7433,24 @@
           <w:t>Filing Instructions Guide 2024</w:t>
         </w:r>
       </w:hyperlink>
+    </w:p>
+    <w:p>
+      <w:pPr/>
+      <w:r>
+        <w:t>[15] CFPB. Regulation C, Official Interpretations for 12 CFR 1003.4(a)(8)(i), Action taken. https://www.consumerfinance.gov/rules-policy/regulations/1003/interp-4/</w:t>
+      </w:r>
+    </w:p>
+    <w:p>
+      <w:pPr/>
+      <w:r>
+        <w:t>[16] Office of the Comptroller of the Currency. Comptroller's Handbook, Mortgage Banking, Version 1.0, Appendix B, pages 164 and 217. https://www.occ.treas.gov/publications-and-resources/publications/comptrollers-handbook/files/mortgage-banking/pub-ch-mortgage-banking.pdf</w:t>
+      </w:r>
+    </w:p>
+    <w:p>
+      <w:pPr/>
+      <w:r>
+        <w:t>[17] CFPB. Intent to Proceed and comparison of mortgage loan offers. https://www.consumerfinance.gov/ask-cfpb/my-loan-officer-said-that-i-need-to-express-my-intent-to-proceed-in-order-for-my-mortgage-loan-application-to-move-forward-what-does-that-mean-en-1989/</w:t>
+      </w:r>
     </w:p>
     <w:p>
       <w:pPr>

</xml_diff>

<commit_message>
docs(research): add the loan approval research plan
</commit_message>
<xml_diff>
--- a/docs/HMDA_New_York_Project_Planning.docx
+++ b/docs/HMDA_New_York_Project_Planning.docx
@@ -31,9 +31,9 @@
         <w:rPr>
           <w:b w:val="0"/>
         </w:rPr>
-        <w:t>Phạm vi và thiết kế thực nghiệm phiên bản 1.1</w:t>
+        <w:t>Phạm vi và thiết kế thực nghiệm phiên bản 1.2</w:t>
         <w:br/>
-        <w:t>Đồng bộ ba RQ và protocol ngày 08 tháng 09 năm 2026</w:t>
+        <w:t>Đồng bộ ba RQ và protocol ngày 11 tháng 09 năm 2026</w:t>
       </w:r>
     </w:p>
     <w:p>
@@ -42,6 +42,38 @@
       </w:pPr>
       <w:r>
         <w:t>1 Mục tiêu và phạm vi</w:t>
+      </w:r>
+    </w:p>
+    <w:p>
+      <w:pPr>
+        <w:pStyle w:val="Heading2"/>
+      </w:pPr>
+      <w:r>
+        <w:t>Bối cảnh kinh doanh</w:t>
+      </w:r>
+    </w:p>
+    <w:p>
+      <w:pPr/>
+      <w:r>
+        <w:t>Trong mortgage lending, quyết định phê duyệt chỉ giải quyết khả năng cấp tín dụng; ngân hàng chỉ ghi nhận một khoản vay phát sinh khi hồ sơ đi đến closing hoặc account opening. Vì vậy, hồ sơ bị từ chối và hồ sơ đã được phê duyệt nhưng không trở thành khoản vay là hai kết quả khác nhau. Kết quả thứ nhất liên quan đến credit decision, còn kết quả thứ hai phản ánh post-approval conversion của mortgage application funnel.</w:t>
+      </w:r>
+    </w:p>
+    <w:p>
+      <w:pPr/>
+      <w:r>
+        <w:t>Regulation C quy định Application approved but not accepted khi tổ chức tài chính đã phê duyệt hồ sơ trước closing hoặc account opening, chỉ còn các điều kiện cam kết hoặc closing thông thường, nhưng người nộp đơn hoặc bên nhận hồ sơ không phản hồi, hoặc giao dịch không được hoàn tất. Người vay cũng có thể xem xét nhiều đề nghị và không tiếp tục với một lender. HMDA không ghi nguyên nhân cụ thể của từng hồ sơ lớp 2, nên các lý do về pricing, cạnh tranh, trải nghiệm hay sự cố closing chỉ được xem là giả thuyết cần dữ liệu bổ sung, không phải kết luận của nghiên cứu. [15, 17]</w:t>
+      </w:r>
+    </w:p>
+    <w:p>
+      <w:pPr/>
+      <w:r>
+        <w:t>Đối với ngân hàng, các khoản vay trong pipeline không đi đến closing được quản trị như fallout. Fallout làm giảm độ chính xác của dự báo số khoản vay sẽ phát sinh và có thể ảnh hưởng đến quản trị pipeline hoặc hedging đối với các khoản vay đã khóa lãi suất. OCC khuyến nghị phân tích lịch sử fallout trong những điều kiện thị trường khác nhau; tài liệu này chỉ dùng căn cứ đó để xác lập nhu cầu kinh doanh, không khẳng định toàn bộ action_taken = 2 thuộc rate-locked pipeline hoặc đã gây ra một mức tổn thất cụ thể. [16]</w:t>
+      </w:r>
+    </w:p>
+    <w:p>
+      <w:pPr/>
+      <w:r>
+        <w:t>Bài toán nghiên cứu vì vậy là đánh giá trạng thái cuối của hồ sơ theo hai góc nhìn liên kết: approval so với denial, và origination so với approved but not accepted trong nhóm đã được phê duyệt. Mô hình ba lớp giữ nguyên ba nhãn danh nghĩa để tránh mất thông tin, còn kết quả được dùng cho phân tích hiệu năng, giải thích toàn cục và audit fairness. Nghiên cứu không thay thế underwriting, không tối ưu profit và không xác định nguyên nhân cá nhân khiến một hồ sơ không đi đến origination.</w:t>
       </w:r>
     </w:p>
     <w:p>
@@ -824,15 +856,8 @@
             </w:tcMar>
           </w:tcPr>
           <w:p>
-            <w:pPr>
-              <w:spacing w:after="20" w:line="247" w:lineRule="auto"/>
-            </w:pPr>
             <w:r>
-              <w:rPr>
-                <w:b w:val="0"/>
-                <w:sz w:val="18"/>
-              </w:rPr>
-              <w:t>Hồ sơ được chấp thuận nhưng người nộp đơn không chấp nhận.</w:t>
+              <w:t>Hồ sơ đã được phê duyệt trước closing hoặc account opening nhưng người nộp đơn/bên nhận hồ sơ không phản hồi, hoặc khoản vay không được hoàn tất. HMDA không cho biết nguyên nhân cụ thể của từng hồ sơ.</w:t>
             </w:r>
           </w:p>
         </w:tc>
@@ -6619,6 +6644,28 @@
           </w:p>
         </w:tc>
       </w:tr>
+      <w:tr>
+        <w:tc>
+          <w:tcPr>
+            <w:tcW w:type="dxa" w:w="3798"/>
+          </w:tcPr>
+          <w:p>
+            <w:r>
+              <w:t>Business context trước đây chỉ mô tả mục tiêu kỹ thuật</w:t>
+            </w:r>
+          </w:p>
+        </w:tc>
+        <w:tc>
+          <w:tcPr>
+            <w:tcW w:type="dxa" w:w="5953"/>
+          </w:tcPr>
+          <w:p>
+            <w:r>
+              <w:t>Bổ sung mortgage application funnel, phân biệt credit decision với post-approval fallout và giới hạn nguyên nhân không quan sát được trong HMDA.</w:t>
+            </w:r>
+          </w:p>
+        </w:tc>
+      </w:tr>
     </w:tbl>
     <w:p>
       <w:pPr>
@@ -7104,7 +7151,7 @@
         <w:rPr>
           <w:b w:val="0"/>
         </w:rPr>
-        <w:t>Nguồn phương pháp và định nghĩa được đối chiếu ngày 08 tháng 09 năm 2026. Các lựa chọn như 12 feature, tỷ lệ chia tập, năm model và phạm vi mở rộng là thiết kế của dự án; không phải yêu cầu từ CFPB hoặc kết quả đã được kiểm nghiệm.</w:t>
+        <w:t>Nguồn phương pháp và định nghĩa được đối chiếu ngày 11 tháng 09 năm 2026. Các lựa chọn như 12 feature, tỷ lệ chia tập, năm model và phạm vi mở rộng là thiết kế của dự án; không phải yêu cầu từ CFPB hoặc kết quả đã được kiểm nghiệm.</w:t>
       </w:r>
     </w:p>
     <w:p>
@@ -7386,6 +7433,24 @@
           <w:t>Filing Instructions Guide 2024</w:t>
         </w:r>
       </w:hyperlink>
+    </w:p>
+    <w:p>
+      <w:pPr/>
+      <w:r>
+        <w:t>[15] CFPB. Regulation C, Official Interpretations for 12 CFR 1003.4(a)(8)(i), Action taken. https://www.consumerfinance.gov/rules-policy/regulations/1003/interp-4/</w:t>
+      </w:r>
+    </w:p>
+    <w:p>
+      <w:pPr/>
+      <w:r>
+        <w:t>[16] Office of the Comptroller of the Currency. Comptroller's Handbook, Mortgage Banking, Version 1.0, Appendix B, pages 164 and 217. https://www.occ.treas.gov/publications-and-resources/publications/comptrollers-handbook/files/mortgage-banking/pub-ch-mortgage-banking.pdf</w:t>
+      </w:r>
+    </w:p>
+    <w:p>
+      <w:pPr/>
+      <w:r>
+        <w:t>[17] CFPB. Intent to Proceed and comparison of mortgage loan offers. https://www.consumerfinance.gov/ask-cfpb/my-loan-officer-said-that-i-need-to-express-my-intent-to-proceed-in-order-for-my-mortgage-loan-application-to-move-forward-what-does-that-mean-en-1989/</w:t>
+      </w:r>
     </w:p>
     <w:p>
       <w:pPr>

</xml_diff>